<commit_message>
Add Phase 2 ML report and update Phase 1 with data protection note
</commit_message>
<xml_diff>
--- a/docs/A&E_Performance_Dashboard_Report_March_2026.docx
+++ b/docs/A&E_Performance_Dashboard_Report_March_2026.docx
@@ -172,7 +172,6 @@
           <w:szCs w:val="24"/>
         </w:rPr>
       </w:pPr>
-      <w:bookmarkStart w:id="0" w:name="_GoBack"/>
       <w:r>
         <w:rPr>
           <w:rFonts w:cstheme="minorHAnsi"/>
@@ -181,8 +180,9 @@
           <w:sz w:val="24"/>
           <w:szCs w:val="24"/>
         </w:rPr>
-        <w:t>Hari</w:t>
-      </w:r>
+        <w:t xml:space="preserve">Hari </w:t>
+      </w:r>
+      <w:proofErr w:type="spellStart"/>
       <w:r>
         <w:rPr>
           <w:rFonts w:cstheme="minorHAnsi"/>
@@ -191,9 +191,9 @@
           <w:sz w:val="24"/>
           <w:szCs w:val="24"/>
         </w:rPr>
-        <w:t xml:space="preserve"> </w:t>
-      </w:r>
-      <w:proofErr w:type="spellStart"/>
+        <w:t>Gharti</w:t>
+      </w:r>
+      <w:proofErr w:type="spellEnd"/>
       <w:r>
         <w:rPr>
           <w:rFonts w:cstheme="minorHAnsi"/>
@@ -202,21 +202,19 @@
           <w:sz w:val="24"/>
           <w:szCs w:val="24"/>
         </w:rPr>
-        <w:t>Gharti</w:t>
-      </w:r>
-      <w:proofErr w:type="spellEnd"/>
-      <w:r>
-        <w:rPr>
-          <w:rFonts w:cstheme="minorHAnsi"/>
-          <w:b/>
-          <w:bCs/>
+        <w:t xml:space="preserve"> Magar</w:t>
+      </w:r>
+    </w:p>
+    <w:p>
+      <w:pPr>
+        <w:jc w:val="center"/>
+        <w:rPr>
+          <w:rFonts w:cstheme="minorHAnsi"/>
           <w:sz w:val="24"/>
           <w:szCs w:val="24"/>
         </w:rPr>
-        <w:t xml:space="preserve"> Magar</w:t>
-      </w:r>
-    </w:p>
-    <w:bookmarkEnd w:id="0"/>
+      </w:pPr>
+    </w:p>
     <w:p>
       <w:pPr>
         <w:jc w:val="center"/>
@@ -246,31 +244,30 @@
           <w:szCs w:val="24"/>
         </w:rPr>
       </w:pPr>
-    </w:p>
-    <w:p>
-      <w:pPr>
-        <w:jc w:val="center"/>
+      <w:r>
+        <w:rPr>
+          <w:rStyle w:val="Strong"/>
+        </w:rPr>
+        <w:t>Power BI Dashboard &amp; Analytical Report</w:t>
+      </w:r>
+      <w:r>
+        <w:t xml:space="preserve"> </w:t>
+      </w:r>
+      <w:r>
+        <w:rPr>
+          <w:rStyle w:val="Strong"/>
+        </w:rPr>
+        <w:t>Urgent and Emergency Care – NHS England</w:t>
+      </w:r>
+    </w:p>
+    <w:p>
+      <w:pPr>
         <w:rPr>
           <w:rFonts w:cstheme="minorHAnsi"/>
           <w:sz w:val="24"/>
           <w:szCs w:val="24"/>
         </w:rPr>
       </w:pPr>
-      <w:r>
-        <w:rPr>
-          <w:rStyle w:val="Strong"/>
-        </w:rPr>
-        <w:t>Power BI Dashboard &amp; Analytical Report</w:t>
-      </w:r>
-      <w:r>
-        <w:t xml:space="preserve"> </w:t>
-      </w:r>
-      <w:r>
-        <w:rPr>
-          <w:rStyle w:val="Strong"/>
-        </w:rPr>
-        <w:t>Urgent and Emergency Care – NHS England</w:t>
-      </w:r>
     </w:p>
     <w:p>
       <w:pPr>
@@ -380,19 +377,14 @@
         </w:rPr>
       </w:pPr>
     </w:p>
-    <w:p>
-      <w:pPr>
-        <w:rPr>
-          <w:rFonts w:cstheme="minorHAnsi"/>
-          <w:sz w:val="24"/>
-          <w:szCs w:val="24"/>
-        </w:rPr>
-      </w:pPr>
-    </w:p>
     <w:sdt>
       <w:sdtPr>
         <w:rPr>
-          <w:rFonts w:asciiTheme="minorHAnsi" w:hAnsiTheme="minorHAnsi" w:cstheme="minorHAnsi"/>
+          <w:rFonts w:asciiTheme="minorHAnsi" w:eastAsiaTheme="minorHAnsi" w:hAnsiTheme="minorHAnsi" w:cstheme="minorHAnsi"/>
+          <w:color w:val="auto"/>
+          <w:sz w:val="22"/>
+          <w:szCs w:val="22"/>
+          <w:lang w:val="en-GB"/>
         </w:rPr>
         <w:id w:val="1559278920"/>
         <w:docPartObj>
@@ -402,14 +394,9 @@
       </w:sdtPr>
       <w:sdtEndPr>
         <w:rPr>
-          <w:rFonts w:eastAsiaTheme="minorHAnsi"/>
           <w:b/>
           <w:bCs/>
           <w:noProof/>
-          <w:color w:val="auto"/>
-          <w:sz w:val="22"/>
-          <w:szCs w:val="22"/>
-          <w:lang w:val="en-GB"/>
         </w:rPr>
       </w:sdtEndPr>
       <w:sdtContent>
@@ -521,7 +508,7 @@
                 <w:noProof/>
                 <w:webHidden/>
               </w:rPr>
-              <w:t>1</w:t>
+              <w:t>3</w:t>
             </w:r>
             <w:r>
               <w:rPr>
@@ -600,7 +587,7 @@
                 <w:noProof/>
                 <w:webHidden/>
               </w:rPr>
-              <w:t>1</w:t>
+              <w:t>3</w:t>
             </w:r>
             <w:r>
               <w:rPr>
@@ -679,7 +666,7 @@
                 <w:noProof/>
                 <w:webHidden/>
               </w:rPr>
-              <w:t>1</w:t>
+              <w:t>3</w:t>
             </w:r>
             <w:r>
               <w:rPr>
@@ -758,7 +745,7 @@
                 <w:noProof/>
                 <w:webHidden/>
               </w:rPr>
-              <w:t>1</w:t>
+              <w:t>3</w:t>
             </w:r>
             <w:r>
               <w:rPr>
@@ -835,7 +822,7 @@
                 <w:noProof/>
                 <w:webHidden/>
               </w:rPr>
-              <w:t>1</w:t>
+              <w:t>3</w:t>
             </w:r>
             <w:r>
               <w:rPr>
@@ -912,7 +899,7 @@
                 <w:noProof/>
                 <w:webHidden/>
               </w:rPr>
-              <w:t>1</w:t>
+              <w:t>3</w:t>
             </w:r>
             <w:r>
               <w:rPr>
@@ -989,7 +976,7 @@
                 <w:noProof/>
                 <w:webHidden/>
               </w:rPr>
-              <w:t>2</w:t>
+              <w:t>4</w:t>
             </w:r>
             <w:r>
               <w:rPr>
@@ -1068,7 +1055,7 @@
                 <w:noProof/>
                 <w:webHidden/>
               </w:rPr>
-              <w:t>2</w:t>
+              <w:t>4</w:t>
             </w:r>
             <w:r>
               <w:rPr>
@@ -1145,7 +1132,7 @@
                 <w:noProof/>
                 <w:webHidden/>
               </w:rPr>
-              <w:t>2</w:t>
+              <w:t>4</w:t>
             </w:r>
             <w:r>
               <w:rPr>
@@ -1222,7 +1209,7 @@
                 <w:noProof/>
                 <w:webHidden/>
               </w:rPr>
-              <w:t>2</w:t>
+              <w:t>4</w:t>
             </w:r>
             <w:r>
               <w:rPr>
@@ -1299,7 +1286,7 @@
                 <w:noProof/>
                 <w:webHidden/>
               </w:rPr>
-              <w:t>2</w:t>
+              <w:t>4</w:t>
             </w:r>
             <w:r>
               <w:rPr>
@@ -1376,7 +1363,7 @@
                 <w:noProof/>
                 <w:webHidden/>
               </w:rPr>
-              <w:t>2</w:t>
+              <w:t>4</w:t>
             </w:r>
             <w:r>
               <w:rPr>
@@ -1455,7 +1442,7 @@
                 <w:noProof/>
                 <w:webHidden/>
               </w:rPr>
-              <w:t>2</w:t>
+              <w:t>4</w:t>
             </w:r>
             <w:r>
               <w:rPr>
@@ -1532,7 +1519,7 @@
                 <w:noProof/>
                 <w:webHidden/>
               </w:rPr>
-              <w:t>2</w:t>
+              <w:t>4</w:t>
             </w:r>
             <w:r>
               <w:rPr>
@@ -1609,7 +1596,7 @@
                 <w:noProof/>
                 <w:webHidden/>
               </w:rPr>
-              <w:t>3</w:t>
+              <w:t>5</w:t>
             </w:r>
             <w:r>
               <w:rPr>
@@ -1686,7 +1673,7 @@
                 <w:noProof/>
                 <w:webHidden/>
               </w:rPr>
-              <w:t>3</w:t>
+              <w:t>5</w:t>
             </w:r>
             <w:r>
               <w:rPr>
@@ -1765,7 +1752,7 @@
                 <w:noProof/>
                 <w:webHidden/>
               </w:rPr>
-              <w:t>4</w:t>
+              <w:t>6</w:t>
             </w:r>
             <w:r>
               <w:rPr>
@@ -1842,7 +1829,7 @@
                 <w:noProof/>
                 <w:webHidden/>
               </w:rPr>
-              <w:t>4</w:t>
+              <w:t>6</w:t>
             </w:r>
             <w:r>
               <w:rPr>
@@ -1919,7 +1906,7 @@
                 <w:noProof/>
                 <w:webHidden/>
               </w:rPr>
-              <w:t>4</w:t>
+              <w:t>6</w:t>
             </w:r>
             <w:r>
               <w:rPr>
@@ -1996,7 +1983,7 @@
                 <w:noProof/>
                 <w:webHidden/>
               </w:rPr>
-              <w:t>4</w:t>
+              <w:t>6</w:t>
             </w:r>
             <w:r>
               <w:rPr>
@@ -2073,7 +2060,7 @@
                 <w:noProof/>
                 <w:webHidden/>
               </w:rPr>
-              <w:t>4</w:t>
+              <w:t>6</w:t>
             </w:r>
             <w:r>
               <w:rPr>
@@ -2152,7 +2139,7 @@
                 <w:noProof/>
                 <w:webHidden/>
               </w:rPr>
-              <w:t>4</w:t>
+              <w:t>6</w:t>
             </w:r>
             <w:r>
               <w:rPr>
@@ -2231,7 +2218,7 @@
                 <w:noProof/>
                 <w:webHidden/>
               </w:rPr>
-              <w:t>4</w:t>
+              <w:t>6</w:t>
             </w:r>
             <w:r>
               <w:rPr>
@@ -2310,7 +2297,7 @@
                 <w:noProof/>
                 <w:webHidden/>
               </w:rPr>
-              <w:t>4</w:t>
+              <w:t>6</w:t>
             </w:r>
             <w:r>
               <w:rPr>
@@ -2393,6 +2380,8 @@
           <w:szCs w:val="24"/>
         </w:rPr>
       </w:pPr>
+      <w:bookmarkStart w:id="0" w:name="_GoBack"/>
+      <w:bookmarkEnd w:id="0"/>
     </w:p>
     <w:p>
       <w:pPr>
@@ -2415,17 +2404,7 @@
           <w:szCs w:val="28"/>
         </w:rPr>
         <w:lastRenderedPageBreak/>
-        <w:t xml:space="preserve">1. </w:t>
-      </w:r>
-      <w:r>
-        <w:rPr>
-          <w:rFonts w:asciiTheme="minorHAnsi" w:hAnsiTheme="minorHAnsi" w:cstheme="minorHAnsi"/>
-          <w:b/>
-          <w:bCs/>
-          <w:sz w:val="28"/>
-          <w:szCs w:val="28"/>
-        </w:rPr>
-        <w:t xml:space="preserve"> Executive Summary</w:t>
+        <w:t>1.  Executive Summary</w:t>
       </w:r>
       <w:bookmarkEnd w:id="1"/>
     </w:p>
@@ -2530,21 +2509,7 @@
             <w:rStyle w:val="Hyperlink"/>
             <w:rFonts w:cstheme="minorHAnsi"/>
           </w:rPr>
-          <w:t xml:space="preserve">Statistics » A&amp;E Attendances and Emergency Admissions </w:t>
-        </w:r>
-        <w:r>
-          <w:rPr>
-            <w:rStyle w:val="Hyperlink"/>
-            <w:rFonts w:cstheme="minorHAnsi"/>
-          </w:rPr>
-          <w:t>2</w:t>
-        </w:r>
-        <w:r>
-          <w:rPr>
-            <w:rStyle w:val="Hyperlink"/>
-            <w:rFonts w:cstheme="minorHAnsi"/>
-          </w:rPr>
-          <w:t>025-26</w:t>
+          <w:t>Statistics » A&amp;E Attendances and Emergency Admissions 2025-26</w:t>
         </w:r>
       </w:hyperlink>
     </w:p>
@@ -2560,6 +2525,42 @@
           <w:rFonts w:cstheme="minorHAnsi"/>
         </w:rPr>
         <w:t>The dataset includes national, regional, and provider level metrics for A&amp;E attendances, emergency admissions, and 4 hour performance.</w:t>
+      </w:r>
+    </w:p>
+    <w:p>
+      <w:pPr>
+        <w:jc w:val="both"/>
+        <w:rPr>
+          <w:b/>
+          <w:bCs/>
+        </w:rPr>
+      </w:pPr>
+      <w:r>
+        <w:rPr>
+          <w:b/>
+          <w:bCs/>
+        </w:rPr>
+        <w:t>Data Protection &amp; Privacy</w:t>
+      </w:r>
+      <w:r>
+        <w:rPr>
+          <w:b/>
+          <w:bCs/>
+        </w:rPr>
+        <w:t>:</w:t>
+      </w:r>
+    </w:p>
+    <w:p>
+      <w:pPr>
+        <w:jc w:val="both"/>
+        <w:rPr>
+          <w:rFonts w:cstheme="minorHAnsi"/>
+          <w:b/>
+          <w:bCs/>
+        </w:rPr>
+      </w:pPr>
+      <w:r>
+        <w:t>This project uses publicly available, fully anonymised datasets. No personal or identifiable patient information was accessed, so data protection regulations such as GDPR and the UK Data Protection Act do not apply.</w:t>
       </w:r>
     </w:p>
     <w:p>
@@ -2927,6 +2928,7 @@
           <w:sz w:val="24"/>
           <w:szCs w:val="24"/>
         </w:rPr>
+        <w:lastRenderedPageBreak/>
         <w:t>4.3 Measures (DAX)</w:t>
       </w:r>
       <w:bookmarkEnd w:id="7"/>
@@ -3036,7 +3038,6 @@
         <w:rPr>
           <w:rFonts w:cstheme="minorHAnsi"/>
         </w:rPr>
-        <w:lastRenderedPageBreak/>
         <w:t>Admissions by ICB</w:t>
       </w:r>
     </w:p>
@@ -3344,6 +3345,7 @@
         <w:rPr>
           <w:rFonts w:asciiTheme="minorHAnsi" w:hAnsiTheme="minorHAnsi" w:cstheme="minorHAnsi"/>
         </w:rPr>
+        <w:lastRenderedPageBreak/>
         <w:t>6.2 KPI Row Screenshot</w:t>
       </w:r>
       <w:bookmarkEnd w:id="15"/>
@@ -3436,7 +3438,6 @@
         <w:rPr>
           <w:rFonts w:asciiTheme="minorHAnsi" w:hAnsiTheme="minorHAnsi" w:cstheme="minorHAnsi"/>
         </w:rPr>
-        <w:lastRenderedPageBreak/>
         <w:t>6.3 Charts Section Screenshot</w:t>
       </w:r>
       <w:bookmarkEnd w:id="16"/>
@@ -3547,6 +3548,7 @@
         <w:rPr>
           <w:rFonts w:cstheme="minorHAnsi"/>
         </w:rPr>
+        <w:lastRenderedPageBreak/>
         <w:t xml:space="preserve">4 Hour Performance by ICB </w:t>
       </w:r>
     </w:p>
@@ -3675,7 +3677,6 @@
           <w:sz w:val="24"/>
           <w:szCs w:val="24"/>
         </w:rPr>
-        <w:lastRenderedPageBreak/>
         <w:t>7.3 High Pressure ICBs</w:t>
       </w:r>
       <w:bookmarkEnd w:id="20"/>
@@ -4027,13 +4028,7 @@
         <w:rPr>
           <w:rFonts w:cstheme="minorHAnsi"/>
         </w:rPr>
-        <w:t>I</w:t>
-      </w:r>
-      <w:r>
-        <w:rPr>
-          <w:rFonts w:cstheme="minorHAnsi"/>
-        </w:rPr>
-        <w:t>nvest in digital flow tools and predictive analytics</w:t>
+        <w:t>Invest in digital flow tools and predictive analytics</w:t>
       </w:r>
     </w:p>
     <w:p>
@@ -4095,15 +4090,7 @@
           <w:b/>
           <w:bCs/>
         </w:rPr>
-        <w:t xml:space="preserve">A. </w:t>
-      </w:r>
-      <w:r>
-        <w:rPr>
-          <w:rFonts w:cstheme="minorHAnsi"/>
-          <w:b/>
-          <w:bCs/>
-        </w:rPr>
-        <w:t>Dataset Revision Notes</w:t>
+        <w:t>A. Dataset Revision Notes</w:t>
       </w:r>
     </w:p>
     <w:p>
@@ -6275,7 +6262,7 @@
 </file>
 
 <file path=customXml/itemProps1.xml><?xml version="1.0" encoding="utf-8"?>
-<ds:datastoreItem xmlns:ds="http://schemas.openxmlformats.org/officeDocument/2006/customXml" ds:itemID="{9FFC61BF-80E0-4616-932E-E51367566B89}">
+<ds:datastoreItem xmlns:ds="http://schemas.openxmlformats.org/officeDocument/2006/customXml" ds:itemID="{AB325FB1-A327-4FA2-BD35-40EBDBF3D989}">
   <ds:schemaRefs>
     <ds:schemaRef ds:uri="http://schemas.openxmlformats.org/officeDocument/2006/bibliography"/>
   </ds:schemaRefs>

</xml_diff>